<commit_message>
Add Assignment 2 (root account creation) and PDF versions of all assignments
- Assignment 2: seven sign-up steps, day-one security tasks, Free Tier,
  common sign-up problems and viva questions, with a flow diagram
- Export all three assignments to PDF for submission
- Tighten Assignment 3 pagination and fix two split paragraphs

Co-Authored-By: Claude Opus 5 <noreply@anthropic.com>
Claude-Session: https://claude.ai/code/session_01NRfZv93KSE8k55oD4KyovF
</commit_message>
<xml_diff>
--- a/Assignments/Assignment-3/AWS-Assignment-3.docx
+++ b/Assignments/Assignment-3/AWS-Assignment-3.docx
@@ -946,11 +946,6 @@
           <w:sz w:val="20"/>
         </w:rPr>
         <w:t>For real human logins AWS now recommends AWS IAM Identity Center (the successor of AWS SSO) instead of individual IAM users. IAM users are still used for learning, for small accounts and for applications, which is why this practical uses them.</w:t>
-      </w:r>
-    </w:p>
-    <w:p>
-      <w:r>
-        <w:br w:type="page"/>
       </w:r>
     </w:p>
     <w:p>
@@ -3474,11 +3469,6 @@
       </w:pPr>
     </w:p>
     <w:p>
-      <w:r>
-        <w:br w:type="page"/>
-      </w:r>
-    </w:p>
-    <w:p>
       <w:pPr>
         <w:pStyle w:val="Heading1"/>
       </w:pPr>
@@ -4368,11 +4358,6 @@
           <w:sz w:val="20"/>
         </w:rPr>
         <w:t>A group is not an identity — it cannot be named as a Principal in a policy and it has no credentials. Groups cannot be nested (a group cannot contain another group). One user can belong to up to 10 groups by default.</w:t>
-      </w:r>
-    </w:p>
-    <w:p>
-      <w:r>
-        <w:br w:type="page"/>
       </w:r>
     </w:p>
     <w:p>
@@ -5600,40 +5585,35 @@
       </w:r>
     </w:p>
     <w:p>
-      <w:r>
-        <w:br w:type="page"/>
+      <w:pPr>
+        <w:pStyle w:val="Heading1"/>
+      </w:pPr>
+      <w:r>
+        <w:t>d)  Assuming an IAM Role by an IAM User</w:t>
       </w:r>
     </w:p>
     <w:p>
       <w:pPr>
-        <w:pStyle w:val="Heading1"/>
-      </w:pPr>
-      <w:r>
-        <w:t>d)  Assuming an IAM Role by an IAM User</w:t>
+        <w:spacing w:after="100" w:before="0"/>
+      </w:pPr>
+      <w:r>
+        <w:rPr>
+          <w:b w:val="0"/>
+          <w:i w:val="0"/>
+          <w:sz w:val="21"/>
+        </w:rPr>
+        <w:t>“Assuming a role” means an IAM user temporarily gives up its own permissions and works with the role's permissions instead. AWS STS issues short-lived credentials for the session.</w:t>
       </w:r>
     </w:p>
     <w:p>
       <w:pPr>
-        <w:spacing w:after="100" w:before="0"/>
-      </w:pPr>
-      <w:r>
-        <w:rPr>
-          <w:b w:val="0"/>
-          <w:i w:val="0"/>
-          <w:sz w:val="21"/>
-        </w:rPr>
-        <w:t>“Assuming a role” means an IAM user temporarily gives up its own permissions and works with the role's permissions instead. AWS STS issues short-lived credentials for the session.</w:t>
-      </w:r>
-    </w:p>
-    <w:p>
-      <w:pPr>
         <w:spacing w:before="120" w:after="40"/>
         <w:jc w:val="center"/>
       </w:pPr>
       <w:r>
         <w:drawing>
           <wp:inline xmlns:a="http://schemas.openxmlformats.org/drawingml/2006/main" xmlns:pic="http://schemas.openxmlformats.org/drawingml/2006/picture">
-            <wp:extent cx="6126480" cy="3088316"/>
+            <wp:extent cx="5394960" cy="2719562"/>
             <wp:docPr id="2" name="Picture 2"/>
             <wp:cNvGraphicFramePr>
               <a:graphicFrameLocks noChangeAspect="1"/>
@@ -5654,7 +5634,7 @@
                   <pic:spPr>
                     <a:xfrm>
                       <a:off x="0" y="0"/>
-                      <a:ext cx="6126480" cy="3088316"/>
+                      <a:ext cx="5394960" cy="2719562"/>
                     </a:xfrm>
                     <a:prstGeom prst="rect"/>
                   </pic:spPr>
@@ -6770,11 +6750,6 @@
         <w:t xml:space="preserve">  }]</w:t>
         <w:br/>
         <w:t>}</w:t>
-      </w:r>
-    </w:p>
-    <w:p>
-      <w:r>
-        <w:br w:type="page"/>
       </w:r>
     </w:p>
     <w:p>
@@ -8690,21 +8665,15 @@
     </w:p>
     <w:p>
       <w:pPr>
-        <w:spacing w:after="100" w:before="0"/>
+        <w:spacing w:after="80"/>
       </w:pPr>
       <w:r>
         <w:rPr>
           <w:b w:val="0"/>
-          <w:i w:val="0"/>
           <w:sz w:val="21"/>
         </w:rPr>
         <w:t xml:space="preserve">In this practical we created an IAM user and saw six different ways of giving it permissions, created a group and managed a whole team's access from one place, created a role with its trust and permissions policies, and finally assumed that role from an IAM user through both the console and the CLI. The key learning is that IAM separates </w:t>
       </w:r>
-    </w:p>
-    <w:p>
-      <w:pPr>
-        <w:spacing w:after="80"/>
-      </w:pPr>
       <w:r>
         <w:rPr>
           <w:b/>

</xml_diff>